<commit_message>
Last minute study notes changes
</commit_message>
<xml_diff>
--- a/study_notes.docx
+++ b/study_notes.docx
@@ -117,12 +117,12 @@
             <wp:extent cx="3498010" cy="1437958"/>
             <wp:effectExtent b="0" l="0" r="0" t="0"/>
             <wp:wrapNone/>
-            <wp:docPr id="12" name="image1.png"/>
+            <wp:docPr id="12" name="image2.png"/>
             <a:graphic>
               <a:graphicData uri="http://schemas.openxmlformats.org/drawingml/2006/picture">
                 <pic:pic>
                   <pic:nvPicPr>
-                    <pic:cNvPr id="0" name="image1.png"/>
+                    <pic:cNvPr id="0" name="image2.png"/>
                     <pic:cNvPicPr preferRelativeResize="0"/>
                   </pic:nvPicPr>
                   <pic:blipFill>
@@ -979,12 +979,12 @@
             <wp:extent cx="1056958" cy="500664"/>
             <wp:effectExtent b="0" l="0" r="0" t="0"/>
             <wp:wrapNone/>
-            <wp:docPr id="14" name="image9.png"/>
+            <wp:docPr id="14" name="image12.png"/>
             <a:graphic>
               <a:graphicData uri="http://schemas.openxmlformats.org/drawingml/2006/picture">
                 <pic:pic>
                   <pic:nvPicPr>
-                    <pic:cNvPr id="0" name="image9.png"/>
+                    <pic:cNvPr id="0" name="image12.png"/>
                     <pic:cNvPicPr preferRelativeResize="0"/>
                   </pic:nvPicPr>
                   <pic:blipFill>
@@ -1225,12 +1225,12 @@
             <wp:extent cx="807407" cy="411043"/>
             <wp:effectExtent b="0" l="0" r="0" t="0"/>
             <wp:wrapNone/>
-            <wp:docPr id="4" name="image2.png"/>
+            <wp:docPr id="4" name="image4.png"/>
             <a:graphic>
               <a:graphicData uri="http://schemas.openxmlformats.org/drawingml/2006/picture">
                 <pic:pic>
                   <pic:nvPicPr>
-                    <pic:cNvPr id="0" name="image2.png"/>
+                    <pic:cNvPr id="0" name="image4.png"/>
                     <pic:cNvPicPr preferRelativeResize="0"/>
                   </pic:nvPicPr>
                   <pic:blipFill>
@@ -1925,7 +1925,7 @@
     </w:p>
     <w:sdt>
       <w:sdtPr>
-        <w:id w:val="-1744583979"/>
+        <w:id w:val="-1020932015"/>
         <w:docPartObj>
           <w:docPartGallery w:val="Table of Contents"/>
           <w:docPartUnique w:val="1"/>
@@ -4695,12 +4695,12 @@
             <wp:extent cx="2196309" cy="1904682"/>
             <wp:effectExtent b="0" l="0" r="0" t="0"/>
             <wp:wrapSquare wrapText="bothSides" distB="114300" distT="114300" distL="114300" distR="114300"/>
-            <wp:docPr id="5" name="image3.png"/>
+            <wp:docPr id="5" name="image10.png"/>
             <a:graphic>
               <a:graphicData uri="http://schemas.openxmlformats.org/drawingml/2006/picture">
                 <pic:pic>
                   <pic:nvPicPr>
-                    <pic:cNvPr id="0" name="image3.png"/>
+                    <pic:cNvPr id="0" name="image10.png"/>
                     <pic:cNvPicPr preferRelativeResize="0"/>
                   </pic:nvPicPr>
                   <pic:blipFill>
@@ -6536,12 +6536,12 @@
           <wp:inline distB="114300" distT="114300" distL="114300" distR="114300">
             <wp:extent cx="1747748" cy="836288"/>
             <wp:effectExtent b="0" l="0" r="0" t="0"/>
-            <wp:docPr id="3" name="image10.png"/>
+            <wp:docPr id="3" name="image1.png"/>
             <a:graphic>
               <a:graphicData uri="http://schemas.openxmlformats.org/drawingml/2006/picture">
                 <pic:pic>
                   <pic:nvPicPr>
-                    <pic:cNvPr id="0" name="image10.png"/>
+                    <pic:cNvPr id="0" name="image1.png"/>
                     <pic:cNvPicPr preferRelativeResize="0"/>
                   </pic:nvPicPr>
                   <pic:blipFill>
@@ -6609,12 +6609,12 @@
           <wp:inline distB="114300" distT="114300" distL="114300" distR="114300">
             <wp:extent cx="3524885" cy="1549852"/>
             <wp:effectExtent b="0" l="0" r="0" t="0"/>
-            <wp:docPr id="11" name="image5.png"/>
+            <wp:docPr id="11" name="image8.png"/>
             <a:graphic>
               <a:graphicData uri="http://schemas.openxmlformats.org/drawingml/2006/picture">
                 <pic:pic>
                   <pic:nvPicPr>
-                    <pic:cNvPr id="0" name="image5.png"/>
+                    <pic:cNvPr id="0" name="image8.png"/>
                     <pic:cNvPicPr preferRelativeResize="0"/>
                   </pic:nvPicPr>
                   <pic:blipFill>
@@ -7898,12 +7898,12 @@
             <wp:extent cx="1599883" cy="1599883"/>
             <wp:effectExtent b="0" l="0" r="0" t="0"/>
             <wp:wrapSquare wrapText="bothSides" distB="114300" distT="114300" distL="114300" distR="114300"/>
-            <wp:docPr id="10" name="image6.png"/>
+            <wp:docPr id="10" name="image9.png"/>
             <a:graphic>
               <a:graphicData uri="http://schemas.openxmlformats.org/drawingml/2006/picture">
                 <pic:pic>
                   <pic:nvPicPr>
-                    <pic:cNvPr id="0" name="image6.png"/>
+                    <pic:cNvPr id="0" name="image9.png"/>
                     <pic:cNvPicPr preferRelativeResize="0"/>
                   </pic:nvPicPr>
                   <pic:blipFill>
@@ -8205,12 +8205,12 @@
           <wp:inline distB="114300" distT="114300" distL="114300" distR="114300">
             <wp:extent cx="3409950" cy="681764"/>
             <wp:effectExtent b="0" l="0" r="0" t="0"/>
-            <wp:docPr id="13" name="image12.png"/>
+            <wp:docPr id="13" name="image11.png"/>
             <a:graphic>
               <a:graphicData uri="http://schemas.openxmlformats.org/drawingml/2006/picture">
                 <pic:pic>
                   <pic:nvPicPr>
-                    <pic:cNvPr id="0" name="image12.png"/>
+                    <pic:cNvPr id="0" name="image11.png"/>
                     <pic:cNvPicPr preferRelativeResize="0"/>
                   </pic:nvPicPr>
                   <pic:blipFill>
@@ -8347,12 +8347,12 @@
             <wp:extent cx="3262431" cy="715053"/>
             <wp:effectExtent b="0" l="0" r="0" t="0"/>
             <wp:wrapSquare wrapText="bothSides" distB="114300" distT="114300" distL="114300" distR="114300"/>
-            <wp:docPr id="6" name="image11.png"/>
+            <wp:docPr id="6" name="image6.png"/>
             <a:graphic>
               <a:graphicData uri="http://schemas.openxmlformats.org/drawingml/2006/picture">
                 <pic:pic>
                   <pic:nvPicPr>
-                    <pic:cNvPr id="0" name="image11.png"/>
+                    <pic:cNvPr id="0" name="image6.png"/>
                     <pic:cNvPicPr preferRelativeResize="0"/>
                   </pic:nvPicPr>
                   <pic:blipFill>
@@ -8471,12 +8471,12 @@
             <wp:extent cx="2107454" cy="1107177"/>
             <wp:effectExtent b="0" l="0" r="0" t="0"/>
             <wp:wrapSquare wrapText="bothSides" distB="114300" distT="114300" distL="114300" distR="114300"/>
-            <wp:docPr id="7" name="image4.png"/>
+            <wp:docPr id="7" name="image5.png"/>
             <a:graphic>
               <a:graphicData uri="http://schemas.openxmlformats.org/drawingml/2006/picture">
                 <pic:pic>
                   <pic:nvPicPr>
-                    <pic:cNvPr id="0" name="image4.png"/>
+                    <pic:cNvPr id="0" name="image5.png"/>
                     <pic:cNvPicPr preferRelativeResize="0"/>
                   </pic:nvPicPr>
                   <pic:blipFill>
@@ -9516,7 +9516,7 @@
         <w:rPr>
           <w:rtl w:val="0"/>
         </w:rPr>
-        <w:t xml:space="preserve">Unlike RGB, these axes map directly onto how the human brian processes colour, using opponent signals (light/dark, red/green, yellow/blue) rather than mixing light intensities. At zero on both A* and B*, the colour is a neutral grey. The further a value moves from zero on either axis, the more vivid and colourful the pixel becomes.</w:t>
+        <w:t xml:space="preserve">Unlike RGB, these axes map directly onto how the human brain processes colour, using opponent signals (light/dark, red/green, yellow/blue) rather than mixing light intensities. At zero on both A* and B*,the colour is a neutral grey. The further a value moves from zero on either axis, the more vivid and colourful the pixel becomes.</w:t>
       </w:r>
     </w:p>
     <w:p>
@@ -9584,12 +9584,12 @@
             <wp:extent cx="2076450" cy="1554675"/>
             <wp:effectExtent b="0" l="0" r="0" t="0"/>
             <wp:wrapSquare wrapText="bothSides" distB="114300" distT="114300" distL="114300" distR="114300"/>
-            <wp:docPr id="9" name="image8.png"/>
+            <wp:docPr id="9" name="image3.png"/>
             <a:graphic>
               <a:graphicData uri="http://schemas.openxmlformats.org/drawingml/2006/picture">
                 <pic:pic>
                   <pic:nvPicPr>
-                    <pic:cNvPr id="0" name="image8.png"/>
+                    <pic:cNvPr id="0" name="image3.png"/>
                     <pic:cNvPicPr preferRelativeResize="0"/>
                   </pic:nvPicPr>
                   <pic:blipFill>
@@ -9915,6 +9915,109 @@
         <w:rPr>
           <w:rtl w:val="0"/>
         </w:rPr>
+      </w:r>
+    </w:p>
+    <w:p>
+      <w:pPr>
+        <w:spacing w:after="240" w:before="240" w:line="240" w:lineRule="auto"/>
+        <w:ind w:left="0"/>
+        <w:rPr/>
+      </w:pPr>
+      <w:r>
+        <w:rPr>
+          <w:rtl w:val="0"/>
+        </w:rPr>
+        <w:t xml:space="preserve">This is simply the straight-line distance between two points in 3D LAB space, like Pythagoras in three dimensions. The result tells you how different the colours look to a human:</w:t>
+      </w:r>
+    </w:p>
+    <w:p>
+      <w:pPr>
+        <w:numPr>
+          <w:ilvl w:val="0"/>
+          <w:numId w:val="9"/>
+        </w:numPr>
+        <w:spacing w:after="0" w:afterAutospacing="0" w:before="240" w:line="240" w:lineRule="auto"/>
+        <w:ind w:left="720" w:hanging="360"/>
+      </w:pPr>
+      <w:r>
+        <w:rPr>
+          <w:rtl w:val="0"/>
+        </w:rPr>
+        <w:t xml:space="preserve">ΔE &lt; 1 — not visible to the human eye</w:t>
+      </w:r>
+    </w:p>
+    <w:p>
+      <w:pPr>
+        <w:numPr>
+          <w:ilvl w:val="0"/>
+          <w:numId w:val="9"/>
+        </w:numPr>
+        <w:spacing w:after="0" w:afterAutospacing="0" w:before="0" w:beforeAutospacing="0" w:line="240" w:lineRule="auto"/>
+        <w:ind w:left="720" w:hanging="360"/>
+      </w:pPr>
+      <w:r>
+        <w:rPr>
+          <w:rtl w:val="0"/>
+        </w:rPr>
+        <w:t xml:space="preserve">ΔE 1–2 — only detectable by a trained expert</w:t>
+      </w:r>
+    </w:p>
+    <w:p>
+      <w:pPr>
+        <w:numPr>
+          <w:ilvl w:val="0"/>
+          <w:numId w:val="9"/>
+        </w:numPr>
+        <w:spacing w:after="0" w:afterAutospacing="0" w:before="0" w:beforeAutospacing="0" w:line="240" w:lineRule="auto"/>
+        <w:ind w:left="720" w:hanging="360"/>
+      </w:pPr>
+      <w:r>
+        <w:rPr>
+          <w:rtl w:val="0"/>
+        </w:rPr>
+        <w:t xml:space="preserve">ΔE 2–3.5 — acceptable in most industrial applications</w:t>
+      </w:r>
+    </w:p>
+    <w:p>
+      <w:pPr>
+        <w:numPr>
+          <w:ilvl w:val="0"/>
+          <w:numId w:val="9"/>
+        </w:numPr>
+        <w:spacing w:after="240" w:before="0" w:beforeAutospacing="0" w:line="240" w:lineRule="auto"/>
+        <w:ind w:left="720" w:hanging="360"/>
+      </w:pPr>
+      <w:r>
+        <w:rPr>
+          <w:rtl w:val="0"/>
+        </w:rPr>
+        <w:t xml:space="preserve">ΔE &gt; 5 — obviously different, would be rejected in quality control</w:t>
+      </w:r>
+    </w:p>
+    <w:p>
+      <w:pPr>
+        <w:spacing w:after="240" w:before="240" w:line="240" w:lineRule="auto"/>
+        <w:ind w:left="0"/>
+        <w:rPr/>
+      </w:pPr>
+      <w:r>
+        <w:rPr>
+          <w:rtl w:val="0"/>
+        </w:rPr>
+        <w:t xml:space="preserve">This is used in automotive manufacturing (matching paint across car panels), textile industry (matching fabric dye lots), food production (monitoring browning), and medical imaging (tracking skin changes).</w:t>
+      </w:r>
+    </w:p>
+    <w:p>
+      <w:pPr>
+        <w:spacing w:after="240" w:before="240" w:line="240" w:lineRule="auto"/>
+        <w:ind w:left="0"/>
+        <w:rPr/>
+      </w:pPr>
+      <w:r>
+        <w:rPr>
+          <w:rtl w:val="0"/>
+        </w:rPr>
+        <w:t xml:space="preserve">Improved versions exist — CIE94 and CIEDE2000 — which are more accurate for highly saturated colours where the basic CIE76 formula above starts to break down. But CIE76 is the one to know for a general explanation.</w:t>
       </w:r>
     </w:p>
     <w:p>
@@ -10239,7 +10342,7 @@
       <w:pPr>
         <w:numPr>
           <w:ilvl w:val="0"/>
-          <w:numId w:val="10"/>
+          <w:numId w:val="11"/>
         </w:numPr>
         <w:spacing w:line="240" w:lineRule="auto"/>
         <w:ind w:left="720" w:hanging="360"/>
@@ -10266,7 +10369,7 @@
       <w:pPr>
         <w:numPr>
           <w:ilvl w:val="0"/>
-          <w:numId w:val="10"/>
+          <w:numId w:val="11"/>
         </w:numPr>
         <w:spacing w:line="240" w:lineRule="auto"/>
         <w:ind w:left="720" w:hanging="360"/>
@@ -10293,7 +10396,7 @@
       <w:pPr>
         <w:numPr>
           <w:ilvl w:val="0"/>
-          <w:numId w:val="10"/>
+          <w:numId w:val="11"/>
         </w:numPr>
         <w:spacing w:line="240" w:lineRule="auto"/>
         <w:ind w:left="720" w:hanging="360"/>
@@ -10320,7 +10423,7 @@
       <w:pPr>
         <w:numPr>
           <w:ilvl w:val="0"/>
-          <w:numId w:val="10"/>
+          <w:numId w:val="11"/>
         </w:numPr>
         <w:spacing w:line="240" w:lineRule="auto"/>
         <w:ind w:left="720" w:hanging="360"/>
@@ -10347,7 +10450,7 @@
       <w:pPr>
         <w:numPr>
           <w:ilvl w:val="0"/>
-          <w:numId w:val="10"/>
+          <w:numId w:val="11"/>
         </w:numPr>
         <w:spacing w:line="240" w:lineRule="auto"/>
         <w:ind w:left="720" w:hanging="360"/>
@@ -12318,7 +12421,7 @@
               <w:widowControl w:val="0"/>
               <w:numPr>
                 <w:ilvl w:val="0"/>
-                <w:numId w:val="9"/>
+                <w:numId w:val="10"/>
               </w:numPr>
               <w:pBdr>
                 <w:top w:space="0" w:sz="0" w:val="nil"/>
@@ -12349,7 +12452,7 @@
               <w:widowControl w:val="0"/>
               <w:numPr>
                 <w:ilvl w:val="0"/>
-                <w:numId w:val="9"/>
+                <w:numId w:val="10"/>
               </w:numPr>
               <w:pBdr>
                 <w:top w:space="0" w:sz="0" w:val="nil"/>
@@ -12380,7 +12483,7 @@
               <w:widowControl w:val="0"/>
               <w:numPr>
                 <w:ilvl w:val="0"/>
-                <w:numId w:val="9"/>
+                <w:numId w:val="10"/>
               </w:numPr>
               <w:pBdr>
                 <w:top w:space="0" w:sz="0" w:val="nil"/>
@@ -15840,6 +15943,116 @@
       </w:rPr>
     </w:lvl>
   </w:abstractNum>
+  <w:abstractNum w:abstractNumId="11">
+    <w:lvl w:ilvl="0">
+      <w:start w:val="1"/>
+      <w:numFmt w:val="bullet"/>
+      <w:lvlText w:val="●"/>
+      <w:lvlJc w:val="left"/>
+      <w:pPr>
+        <w:ind w:left="720" w:hanging="360"/>
+      </w:pPr>
+      <w:rPr>
+        <w:u w:val="none"/>
+      </w:rPr>
+    </w:lvl>
+    <w:lvl w:ilvl="1">
+      <w:start w:val="1"/>
+      <w:numFmt w:val="bullet"/>
+      <w:lvlText w:val="○"/>
+      <w:lvlJc w:val="left"/>
+      <w:pPr>
+        <w:ind w:left="1440" w:hanging="360"/>
+      </w:pPr>
+      <w:rPr>
+        <w:u w:val="none"/>
+      </w:rPr>
+    </w:lvl>
+    <w:lvl w:ilvl="2">
+      <w:start w:val="1"/>
+      <w:numFmt w:val="bullet"/>
+      <w:lvlText w:val="■"/>
+      <w:lvlJc w:val="left"/>
+      <w:pPr>
+        <w:ind w:left="2160" w:hanging="360"/>
+      </w:pPr>
+      <w:rPr>
+        <w:u w:val="none"/>
+      </w:rPr>
+    </w:lvl>
+    <w:lvl w:ilvl="3">
+      <w:start w:val="1"/>
+      <w:numFmt w:val="bullet"/>
+      <w:lvlText w:val="●"/>
+      <w:lvlJc w:val="left"/>
+      <w:pPr>
+        <w:ind w:left="2880" w:hanging="360"/>
+      </w:pPr>
+      <w:rPr>
+        <w:u w:val="none"/>
+      </w:rPr>
+    </w:lvl>
+    <w:lvl w:ilvl="4">
+      <w:start w:val="1"/>
+      <w:numFmt w:val="bullet"/>
+      <w:lvlText w:val="○"/>
+      <w:lvlJc w:val="left"/>
+      <w:pPr>
+        <w:ind w:left="3600" w:hanging="360"/>
+      </w:pPr>
+      <w:rPr>
+        <w:u w:val="none"/>
+      </w:rPr>
+    </w:lvl>
+    <w:lvl w:ilvl="5">
+      <w:start w:val="1"/>
+      <w:numFmt w:val="bullet"/>
+      <w:lvlText w:val="■"/>
+      <w:lvlJc w:val="left"/>
+      <w:pPr>
+        <w:ind w:left="4320" w:hanging="360"/>
+      </w:pPr>
+      <w:rPr>
+        <w:u w:val="none"/>
+      </w:rPr>
+    </w:lvl>
+    <w:lvl w:ilvl="6">
+      <w:start w:val="1"/>
+      <w:numFmt w:val="bullet"/>
+      <w:lvlText w:val="●"/>
+      <w:lvlJc w:val="left"/>
+      <w:pPr>
+        <w:ind w:left="5040" w:hanging="360"/>
+      </w:pPr>
+      <w:rPr>
+        <w:u w:val="none"/>
+      </w:rPr>
+    </w:lvl>
+    <w:lvl w:ilvl="7">
+      <w:start w:val="1"/>
+      <w:numFmt w:val="bullet"/>
+      <w:lvlText w:val="○"/>
+      <w:lvlJc w:val="left"/>
+      <w:pPr>
+        <w:ind w:left="5760" w:hanging="360"/>
+      </w:pPr>
+      <w:rPr>
+        <w:u w:val="none"/>
+      </w:rPr>
+    </w:lvl>
+    <w:lvl w:ilvl="8">
+      <w:start w:val="1"/>
+      <w:numFmt w:val="bullet"/>
+      <w:lvlText w:val="■"/>
+      <w:lvlJc w:val="left"/>
+      <w:pPr>
+        <w:ind w:left="6480" w:hanging="360"/>
+      </w:pPr>
+      <w:rPr>
+        <w:u w:val="none"/>
+      </w:rPr>
+    </w:lvl>
+  </w:abstractNum>
   <w:num w:numId="1">
     <w:abstractNumId w:val="1"/>
   </w:num>
@@ -15869,6 +16082,9 @@
   </w:num>
   <w:num w:numId="10">
     <w:abstractNumId w:val="10"/>
+  </w:num>
+  <w:num w:numId="11">
+    <w:abstractNumId w:val="11"/>
   </w:num>
 </w:numbering>
 </file>

</xml_diff>